<commit_message>
Implemented question paper generation with section-wise tables and DOCX export
</commit_message>
<xml_diff>
--- a/templates/question_paper_template.docx
+++ b/templates/question_paper_template.docx
@@ -1250,7 +1250,6 @@
     <w:p>
       <w:pPr>
         <w:pStyle w:val="TableParagraph"/>
-        <w:jc w:val="center"/>
         <w:rPr>
           <w:sz w:val="24"/>
         </w:rPr>
@@ -1267,223 +1266,1550 @@
         <w:rPr>
           <w:sz w:val="24"/>
         </w:rPr>
-        <w:t>SECTION A – Unit 1</w:t>
+        <w:t>SECTION A – Unit 1 [Solve Any Two]</w:t>
+      </w:r>
+    </w:p>
+    <w:p>
+      <w:pPr>
+        <w:pStyle w:val="TableParagraph"/>
+        <w:rPr>
+          <w:sz w:val="24"/>
+        </w:rPr>
+      </w:pPr>
+    </w:p>
+    <w:tbl>
+      <w:tblPr>
+        <w:tblStyle w:val="TableGrid"/>
+        <w:tblW w:w="0" w:type="auto"/>
+        <w:tblLook w:val="04A0" w:firstRow="1" w:lastRow="0" w:firstColumn="1" w:lastColumn="0" w:noHBand="0" w:noVBand="1"/>
+      </w:tblPr>
+      <w:tblGrid>
+        <w:gridCol w:w="1794"/>
+        <w:gridCol w:w="1794"/>
+        <w:gridCol w:w="1794"/>
+        <w:gridCol w:w="1795"/>
+        <w:gridCol w:w="1795"/>
+        <w:gridCol w:w="1795"/>
+      </w:tblGrid>
+      <w:tr>
+        <w:tc>
+          <w:tcPr>
+            <w:tcW w:w="1794" w:type="dxa"/>
+          </w:tcPr>
+          <w:p>
+            <w:pPr>
+              <w:pStyle w:val="TableParagraph"/>
+              <w:rPr>
+                <w:sz w:val="24"/>
+              </w:rPr>
+            </w:pPr>
+            <w:r>
+              <w:t>Q1</w:t>
+            </w:r>
+          </w:p>
+        </w:tc>
+        <w:tc>
+          <w:tcPr>
+            <w:tcW w:w="1794" w:type="dxa"/>
+          </w:tcPr>
+          <w:p>
+            <w:pPr>
+              <w:pStyle w:val="TableParagraph"/>
+              <w:rPr>
+                <w:sz w:val="24"/>
+              </w:rPr>
+            </w:pPr>
+            <w:r>
+              <w:t xml:space="preserve">Question from Unit </w:t>
+            </w:r>
+            <w:r>
+              <w:t>1</w:t>
+            </w:r>
+          </w:p>
+        </w:tc>
+        <w:tc>
+          <w:tcPr>
+            <w:tcW w:w="1794" w:type="dxa"/>
+          </w:tcPr>
+          <w:p>
+            <w:pPr>
+              <w:pStyle w:val="TableParagraph"/>
+              <w:rPr>
+                <w:sz w:val="24"/>
+              </w:rPr>
+            </w:pPr>
+            <w:r>
+              <w:t>CO1</w:t>
+            </w:r>
+          </w:p>
+        </w:tc>
+        <w:tc>
+          <w:tcPr>
+            <w:tcW w:w="1795" w:type="dxa"/>
+          </w:tcPr>
+          <w:p>
+            <w:pPr>
+              <w:pStyle w:val="TableParagraph"/>
+              <w:rPr>
+                <w:sz w:val="24"/>
+              </w:rPr>
+            </w:pPr>
+            <w:r>
+              <w:t>PO1</w:t>
+            </w:r>
+          </w:p>
+        </w:tc>
+        <w:tc>
+          <w:tcPr>
+            <w:tcW w:w="1795" w:type="dxa"/>
+          </w:tcPr>
+          <w:p>
+            <w:pPr>
+              <w:pStyle w:val="TableParagraph"/>
+              <w:rPr>
+                <w:sz w:val="24"/>
+              </w:rPr>
+            </w:pPr>
+            <w:r>
+              <w:t>Understand</w:t>
+            </w:r>
+          </w:p>
+        </w:tc>
+        <w:tc>
+          <w:tcPr>
+            <w:tcW w:w="1795" w:type="dxa"/>
+          </w:tcPr>
+          <w:p>
+            <w:pPr>
+              <w:pStyle w:val="TableParagraph"/>
+              <w:rPr>
+                <w:sz w:val="24"/>
+              </w:rPr>
+            </w:pPr>
+            <w:r>
+              <w:t>2</w:t>
+            </w:r>
+          </w:p>
+        </w:tc>
+      </w:tr>
+      <w:tr>
+        <w:tc>
+          <w:tcPr>
+            <w:tcW w:w="1794" w:type="dxa"/>
+          </w:tcPr>
+          <w:p>
+            <w:pPr>
+              <w:pStyle w:val="TableParagraph"/>
+              <w:rPr>
+                <w:sz w:val="24"/>
+              </w:rPr>
+            </w:pPr>
+            <w:r>
+              <w:t>Q2</w:t>
+            </w:r>
+          </w:p>
+        </w:tc>
+        <w:tc>
+          <w:tcPr>
+            <w:tcW w:w="1794" w:type="dxa"/>
+          </w:tcPr>
+          <w:p>
+            <w:pPr>
+              <w:pStyle w:val="TableParagraph"/>
+              <w:rPr>
+                <w:sz w:val="24"/>
+              </w:rPr>
+            </w:pPr>
+            <w:r>
+              <w:t xml:space="preserve">Question from Unit </w:t>
+            </w:r>
+            <w:r>
+              <w:t>1</w:t>
+            </w:r>
+          </w:p>
+        </w:tc>
+        <w:tc>
+          <w:tcPr>
+            <w:tcW w:w="1794" w:type="dxa"/>
+          </w:tcPr>
+          <w:p>
+            <w:pPr>
+              <w:pStyle w:val="TableParagraph"/>
+              <w:rPr>
+                <w:sz w:val="24"/>
+              </w:rPr>
+            </w:pPr>
+            <w:r>
+              <w:t>CO2</w:t>
+            </w:r>
+          </w:p>
+        </w:tc>
+        <w:tc>
+          <w:tcPr>
+            <w:tcW w:w="1795" w:type="dxa"/>
+          </w:tcPr>
+          <w:p>
+            <w:pPr>
+              <w:pStyle w:val="TableParagraph"/>
+              <w:rPr>
+                <w:sz w:val="24"/>
+              </w:rPr>
+            </w:pPr>
+            <w:r>
+              <w:t>PO2</w:t>
+            </w:r>
+          </w:p>
+        </w:tc>
+        <w:tc>
+          <w:tcPr>
+            <w:tcW w:w="1795" w:type="dxa"/>
+          </w:tcPr>
+          <w:p>
+            <w:pPr>
+              <w:pStyle w:val="TableParagraph"/>
+              <w:rPr>
+                <w:sz w:val="24"/>
+              </w:rPr>
+            </w:pPr>
+            <w:r>
+              <w:t>Understand</w:t>
+            </w:r>
+          </w:p>
+        </w:tc>
+        <w:tc>
+          <w:tcPr>
+            <w:tcW w:w="1795" w:type="dxa"/>
+          </w:tcPr>
+          <w:p>
+            <w:pPr>
+              <w:pStyle w:val="TableParagraph"/>
+              <w:rPr>
+                <w:sz w:val="24"/>
+              </w:rPr>
+            </w:pPr>
+            <w:r>
+              <w:t>2</w:t>
+            </w:r>
+          </w:p>
+        </w:tc>
+      </w:tr>
+      <w:tr>
+        <w:tc>
+          <w:tcPr>
+            <w:tcW w:w="1794" w:type="dxa"/>
+          </w:tcPr>
+          <w:p>
+            <w:pPr>
+              <w:pStyle w:val="TableParagraph"/>
+              <w:rPr>
+                <w:sz w:val="24"/>
+              </w:rPr>
+            </w:pPr>
+            <w:r>
+              <w:t>Q3</w:t>
+            </w:r>
+          </w:p>
+        </w:tc>
+        <w:tc>
+          <w:tcPr>
+            <w:tcW w:w="1794" w:type="dxa"/>
+          </w:tcPr>
+          <w:p>
+            <w:pPr>
+              <w:pStyle w:val="TableParagraph"/>
+              <w:rPr>
+                <w:sz w:val="24"/>
+              </w:rPr>
+            </w:pPr>
+            <w:r>
+              <w:t xml:space="preserve">Question from Unit </w:t>
+            </w:r>
+            <w:r>
+              <w:t>1</w:t>
+            </w:r>
+          </w:p>
+        </w:tc>
+        <w:tc>
+          <w:tcPr>
+            <w:tcW w:w="1794" w:type="dxa"/>
+          </w:tcPr>
+          <w:p>
+            <w:pPr>
+              <w:pStyle w:val="TableParagraph"/>
+              <w:rPr>
+                <w:sz w:val="24"/>
+              </w:rPr>
+            </w:pPr>
+            <w:r>
+              <w:t>CO3</w:t>
+            </w:r>
+          </w:p>
+        </w:tc>
+        <w:tc>
+          <w:tcPr>
+            <w:tcW w:w="1795" w:type="dxa"/>
+          </w:tcPr>
+          <w:p>
+            <w:pPr>
+              <w:pStyle w:val="TableParagraph"/>
+              <w:rPr>
+                <w:sz w:val="24"/>
+              </w:rPr>
+            </w:pPr>
+            <w:r>
+              <w:t>PO3</w:t>
+            </w:r>
+          </w:p>
+        </w:tc>
+        <w:tc>
+          <w:tcPr>
+            <w:tcW w:w="1795" w:type="dxa"/>
+          </w:tcPr>
+          <w:p>
+            <w:pPr>
+              <w:pStyle w:val="TableParagraph"/>
+              <w:rPr>
+                <w:sz w:val="24"/>
+              </w:rPr>
+            </w:pPr>
+            <w:r>
+              <w:t>Understand</w:t>
+            </w:r>
+          </w:p>
+        </w:tc>
+        <w:tc>
+          <w:tcPr>
+            <w:tcW w:w="1795" w:type="dxa"/>
+          </w:tcPr>
+          <w:p>
+            <w:pPr>
+              <w:pStyle w:val="TableParagraph"/>
+              <w:rPr>
+                <w:sz w:val="24"/>
+              </w:rPr>
+            </w:pPr>
+            <w:r>
+              <w:t>2</w:t>
+            </w:r>
+          </w:p>
+        </w:tc>
+      </w:tr>
+    </w:tbl>
+    <w:p>
+      <w:pPr>
+        <w:pStyle w:val="TableParagraph"/>
+        <w:rPr>
+          <w:sz w:val="24"/>
+        </w:rPr>
+      </w:pPr>
+    </w:p>
+    <w:p>
+      <w:pPr>
+        <w:pStyle w:val="TableParagraph"/>
+        <w:rPr>
+          <w:sz w:val="24"/>
+        </w:rPr>
+      </w:pPr>
+    </w:p>
+    <w:p>
+      <w:pPr>
+        <w:pStyle w:val="TableParagraph"/>
+        <w:rPr>
+          <w:sz w:val="24"/>
+        </w:rPr>
+      </w:pPr>
+      <w:r>
+        <w:rPr>
+          <w:sz w:val="24"/>
+        </w:rPr>
+        <w:t xml:space="preserve">SECTION </w:t>
       </w:r>
       <w:r>
         <w:rPr>
           <w:sz w:val="24"/>
         </w:rPr>
-        <w:br/>
-        <w:t>(2 Marks Each) [Solve Any Two]</w:t>
+        <w:t>B</w:t>
       </w:r>
       <w:r>
         <w:rPr>
           <w:sz w:val="24"/>
         </w:rPr>
-        <w:br/>
+        <w:t xml:space="preserve"> – Unit </w:t>
       </w:r>
       <w:r>
         <w:rPr>
           <w:sz w:val="24"/>
         </w:rPr>
-        <w:br/>
-        <w:t>{{SECTION_A_Q1}}</w:t>
+        <w:t>2</w:t>
       </w:r>
       <w:r>
         <w:rPr>
           <w:sz w:val="24"/>
         </w:rPr>
-        <w:br/>
-        <w:t>{{SECTION_A_Q2}}</w:t>
+        <w:t xml:space="preserve"> [Solve Any Two]</w:t>
+      </w:r>
+    </w:p>
+    <w:p>
+      <w:pPr>
+        <w:pStyle w:val="TableParagraph"/>
+        <w:rPr>
+          <w:sz w:val="24"/>
+        </w:rPr>
+      </w:pPr>
+    </w:p>
+    <w:tbl>
+      <w:tblPr>
+        <w:tblStyle w:val="TableGrid"/>
+        <w:tblW w:w="0" w:type="auto"/>
+        <w:tblLook w:val="04A0" w:firstRow="1" w:lastRow="0" w:firstColumn="1" w:lastColumn="0" w:noHBand="0" w:noVBand="1"/>
+      </w:tblPr>
+      <w:tblGrid>
+        <w:gridCol w:w="1794"/>
+        <w:gridCol w:w="1794"/>
+        <w:gridCol w:w="1794"/>
+        <w:gridCol w:w="1795"/>
+        <w:gridCol w:w="1795"/>
+        <w:gridCol w:w="1795"/>
+      </w:tblGrid>
+      <w:tr>
+        <w:tc>
+          <w:tcPr>
+            <w:tcW w:w="1794" w:type="dxa"/>
+          </w:tcPr>
+          <w:p>
+            <w:pPr>
+              <w:pStyle w:val="TableParagraph"/>
+              <w:rPr>
+                <w:sz w:val="24"/>
+              </w:rPr>
+            </w:pPr>
+            <w:r>
+              <w:t>Q</w:t>
+            </w:r>
+            <w:r>
+              <w:t>4</w:t>
+            </w:r>
+          </w:p>
+        </w:tc>
+        <w:tc>
+          <w:tcPr>
+            <w:tcW w:w="1794" w:type="dxa"/>
+          </w:tcPr>
+          <w:p>
+            <w:pPr>
+              <w:pStyle w:val="TableParagraph"/>
+              <w:rPr>
+                <w:sz w:val="24"/>
+              </w:rPr>
+            </w:pPr>
+            <w:r>
+              <w:t>Question from Unit 2</w:t>
+            </w:r>
+          </w:p>
+        </w:tc>
+        <w:tc>
+          <w:tcPr>
+            <w:tcW w:w="1794" w:type="dxa"/>
+          </w:tcPr>
+          <w:p>
+            <w:pPr>
+              <w:pStyle w:val="TableParagraph"/>
+              <w:rPr>
+                <w:sz w:val="24"/>
+              </w:rPr>
+            </w:pPr>
+            <w:r>
+              <w:t>CO4</w:t>
+            </w:r>
+          </w:p>
+        </w:tc>
+        <w:tc>
+          <w:tcPr>
+            <w:tcW w:w="1795" w:type="dxa"/>
+          </w:tcPr>
+          <w:p>
+            <w:pPr>
+              <w:pStyle w:val="TableParagraph"/>
+              <w:rPr>
+                <w:sz w:val="24"/>
+              </w:rPr>
+            </w:pPr>
+            <w:r>
+              <w:t>PO4</w:t>
+            </w:r>
+          </w:p>
+        </w:tc>
+        <w:tc>
+          <w:tcPr>
+            <w:tcW w:w="1795" w:type="dxa"/>
+          </w:tcPr>
+          <w:p>
+            <w:pPr>
+              <w:pStyle w:val="TableParagraph"/>
+              <w:rPr>
+                <w:sz w:val="24"/>
+              </w:rPr>
+            </w:pPr>
+            <w:r>
+              <w:t>Apply</w:t>
+            </w:r>
+          </w:p>
+        </w:tc>
+        <w:tc>
+          <w:tcPr>
+            <w:tcW w:w="1795" w:type="dxa"/>
+          </w:tcPr>
+          <w:p>
+            <w:pPr>
+              <w:pStyle w:val="TableParagraph"/>
+              <w:rPr>
+                <w:sz w:val="24"/>
+              </w:rPr>
+            </w:pPr>
+            <w:r>
+              <w:t>2</w:t>
+            </w:r>
+          </w:p>
+        </w:tc>
+      </w:tr>
+      <w:tr>
+        <w:tc>
+          <w:tcPr>
+            <w:tcW w:w="1794" w:type="dxa"/>
+          </w:tcPr>
+          <w:p>
+            <w:pPr>
+              <w:pStyle w:val="TableParagraph"/>
+              <w:rPr>
+                <w:sz w:val="24"/>
+              </w:rPr>
+            </w:pPr>
+            <w:r>
+              <w:t>Q5</w:t>
+            </w:r>
+          </w:p>
+        </w:tc>
+        <w:tc>
+          <w:tcPr>
+            <w:tcW w:w="1794" w:type="dxa"/>
+          </w:tcPr>
+          <w:p>
+            <w:pPr>
+              <w:pStyle w:val="TableParagraph"/>
+              <w:rPr>
+                <w:sz w:val="24"/>
+              </w:rPr>
+            </w:pPr>
+            <w:r>
+              <w:t>Question from Unit 2</w:t>
+            </w:r>
+          </w:p>
+        </w:tc>
+        <w:tc>
+          <w:tcPr>
+            <w:tcW w:w="1794" w:type="dxa"/>
+          </w:tcPr>
+          <w:p>
+            <w:pPr>
+              <w:pStyle w:val="TableParagraph"/>
+              <w:rPr>
+                <w:sz w:val="24"/>
+              </w:rPr>
+            </w:pPr>
+            <w:r>
+              <w:t>CO5</w:t>
+            </w:r>
+          </w:p>
+        </w:tc>
+        <w:tc>
+          <w:tcPr>
+            <w:tcW w:w="1795" w:type="dxa"/>
+          </w:tcPr>
+          <w:p>
+            <w:pPr>
+              <w:pStyle w:val="TableParagraph"/>
+              <w:rPr>
+                <w:sz w:val="24"/>
+              </w:rPr>
+            </w:pPr>
+            <w:r>
+              <w:t>PO5</w:t>
+            </w:r>
+          </w:p>
+        </w:tc>
+        <w:tc>
+          <w:tcPr>
+            <w:tcW w:w="1795" w:type="dxa"/>
+          </w:tcPr>
+          <w:p>
+            <w:pPr>
+              <w:pStyle w:val="TableParagraph"/>
+              <w:rPr>
+                <w:sz w:val="24"/>
+              </w:rPr>
+            </w:pPr>
+            <w:r>
+              <w:t>Apply</w:t>
+            </w:r>
+          </w:p>
+        </w:tc>
+        <w:tc>
+          <w:tcPr>
+            <w:tcW w:w="1795" w:type="dxa"/>
+          </w:tcPr>
+          <w:p>
+            <w:pPr>
+              <w:pStyle w:val="TableParagraph"/>
+              <w:rPr>
+                <w:sz w:val="24"/>
+              </w:rPr>
+            </w:pPr>
+            <w:r>
+              <w:t>2</w:t>
+            </w:r>
+          </w:p>
+        </w:tc>
+      </w:tr>
+      <w:tr>
+        <w:tc>
+          <w:tcPr>
+            <w:tcW w:w="1794" w:type="dxa"/>
+          </w:tcPr>
+          <w:p>
+            <w:pPr>
+              <w:pStyle w:val="TableParagraph"/>
+              <w:rPr>
+                <w:sz w:val="24"/>
+              </w:rPr>
+            </w:pPr>
+            <w:r>
+              <w:t>Q6</w:t>
+            </w:r>
+          </w:p>
+        </w:tc>
+        <w:tc>
+          <w:tcPr>
+            <w:tcW w:w="1794" w:type="dxa"/>
+          </w:tcPr>
+          <w:p>
+            <w:pPr>
+              <w:pStyle w:val="TableParagraph"/>
+              <w:rPr>
+                <w:sz w:val="24"/>
+              </w:rPr>
+            </w:pPr>
+            <w:r>
+              <w:t>Question from Unit 2</w:t>
+            </w:r>
+          </w:p>
+        </w:tc>
+        <w:tc>
+          <w:tcPr>
+            <w:tcW w:w="1794" w:type="dxa"/>
+          </w:tcPr>
+          <w:p>
+            <w:pPr>
+              <w:pStyle w:val="TableParagraph"/>
+              <w:rPr>
+                <w:sz w:val="24"/>
+              </w:rPr>
+            </w:pPr>
+            <w:r>
+              <w:t>CO6</w:t>
+            </w:r>
+          </w:p>
+        </w:tc>
+        <w:tc>
+          <w:tcPr>
+            <w:tcW w:w="1795" w:type="dxa"/>
+          </w:tcPr>
+          <w:p>
+            <w:pPr>
+              <w:pStyle w:val="TableParagraph"/>
+              <w:rPr>
+                <w:sz w:val="24"/>
+              </w:rPr>
+            </w:pPr>
+            <w:r>
+              <w:t>PO6</w:t>
+            </w:r>
+          </w:p>
+        </w:tc>
+        <w:tc>
+          <w:tcPr>
+            <w:tcW w:w="1795" w:type="dxa"/>
+          </w:tcPr>
+          <w:p>
+            <w:pPr>
+              <w:pStyle w:val="TableParagraph"/>
+              <w:rPr>
+                <w:sz w:val="24"/>
+              </w:rPr>
+            </w:pPr>
+            <w:r>
+              <w:t>Apply</w:t>
+            </w:r>
+          </w:p>
+        </w:tc>
+        <w:tc>
+          <w:tcPr>
+            <w:tcW w:w="1795" w:type="dxa"/>
+          </w:tcPr>
+          <w:p>
+            <w:pPr>
+              <w:pStyle w:val="TableParagraph"/>
+              <w:rPr>
+                <w:sz w:val="24"/>
+              </w:rPr>
+            </w:pPr>
+            <w:r>
+              <w:t>2</w:t>
+            </w:r>
+          </w:p>
+        </w:tc>
+      </w:tr>
+    </w:tbl>
+    <w:p>
+      <w:pPr>
+        <w:pStyle w:val="TableParagraph"/>
+        <w:rPr>
+          <w:sz w:val="24"/>
+        </w:rPr>
+      </w:pPr>
+    </w:p>
+    <w:p>
+      <w:pPr>
+        <w:pStyle w:val="TableParagraph"/>
+        <w:rPr>
+          <w:sz w:val="24"/>
+        </w:rPr>
+      </w:pPr>
+    </w:p>
+    <w:p>
+      <w:pPr>
+        <w:pStyle w:val="TableParagraph"/>
+        <w:rPr>
+          <w:sz w:val="24"/>
+        </w:rPr>
+      </w:pPr>
+    </w:p>
+    <w:p>
+      <w:pPr>
+        <w:pStyle w:val="TableParagraph"/>
+        <w:rPr>
+          <w:sz w:val="24"/>
+        </w:rPr>
+      </w:pPr>
+    </w:p>
+    <w:p>
+      <w:pPr>
+        <w:pStyle w:val="TableParagraph"/>
+        <w:rPr>
+          <w:sz w:val="24"/>
+        </w:rPr>
+      </w:pPr>
+    </w:p>
+    <w:p>
+      <w:pPr>
+        <w:pStyle w:val="TableParagraph"/>
+        <w:rPr>
+          <w:sz w:val="24"/>
+        </w:rPr>
+      </w:pPr>
+      <w:r>
+        <w:rPr>
+          <w:sz w:val="24"/>
+        </w:rPr>
+        <w:lastRenderedPageBreak/>
+        <w:t xml:space="preserve">SECTION </w:t>
       </w:r>
       <w:r>
         <w:rPr>
           <w:sz w:val="24"/>
         </w:rPr>
-        <w:br/>
-        <w:t>{{SECTION_A_Q3}}</w:t>
+        <w:t xml:space="preserve">C </w:t>
       </w:r>
       <w:r>
         <w:rPr>
           <w:sz w:val="24"/>
         </w:rPr>
-        <w:br/>
+        <w:t xml:space="preserve">– Unit </w:t>
       </w:r>
       <w:r>
         <w:rPr>
           <w:sz w:val="24"/>
         </w:rPr>
-        <w:br/>
-        <w:t>SECTION B – Unit 2</w:t>
+        <w:t>3</w:t>
       </w:r>
       <w:r>
         <w:rPr>
           <w:sz w:val="24"/>
         </w:rPr>
-        <w:br/>
-        <w:t>(2 Marks Each) [Solve Any Two]</w:t>
+        <w:t xml:space="preserve"> [Solve Any Two]</w:t>
+      </w:r>
+    </w:p>
+    <w:p>
+      <w:pPr>
+        <w:pStyle w:val="TableParagraph"/>
+        <w:rPr>
+          <w:sz w:val="24"/>
+        </w:rPr>
+      </w:pPr>
+    </w:p>
+    <w:tbl>
+      <w:tblPr>
+        <w:tblStyle w:val="TableGrid"/>
+        <w:tblW w:w="0" w:type="auto"/>
+        <w:tblLook w:val="04A0" w:firstRow="1" w:lastRow="0" w:firstColumn="1" w:lastColumn="0" w:noHBand="0" w:noVBand="1"/>
+      </w:tblPr>
+      <w:tblGrid>
+        <w:gridCol w:w="1794"/>
+        <w:gridCol w:w="1794"/>
+        <w:gridCol w:w="1794"/>
+        <w:gridCol w:w="1795"/>
+        <w:gridCol w:w="1795"/>
+        <w:gridCol w:w="1795"/>
+      </w:tblGrid>
+      <w:tr>
+        <w:tc>
+          <w:tcPr>
+            <w:tcW w:w="1794" w:type="dxa"/>
+          </w:tcPr>
+          <w:p>
+            <w:pPr>
+              <w:pStyle w:val="TableParagraph"/>
+              <w:rPr>
+                <w:sz w:val="24"/>
+              </w:rPr>
+            </w:pPr>
+            <w:r>
+              <w:t>Q</w:t>
+            </w:r>
+            <w:r>
+              <w:t>7</w:t>
+            </w:r>
+          </w:p>
+        </w:tc>
+        <w:tc>
+          <w:tcPr>
+            <w:tcW w:w="1794" w:type="dxa"/>
+          </w:tcPr>
+          <w:p>
+            <w:pPr>
+              <w:pStyle w:val="TableParagraph"/>
+              <w:rPr>
+                <w:sz w:val="24"/>
+              </w:rPr>
+            </w:pPr>
+            <w:r>
+              <w:t>Question from Unit 3</w:t>
+            </w:r>
+          </w:p>
+        </w:tc>
+        <w:tc>
+          <w:tcPr>
+            <w:tcW w:w="1794" w:type="dxa"/>
+          </w:tcPr>
+          <w:p>
+            <w:pPr>
+              <w:pStyle w:val="TableParagraph"/>
+              <w:rPr>
+                <w:sz w:val="24"/>
+              </w:rPr>
+            </w:pPr>
+            <w:r>
+              <w:t>CO1</w:t>
+            </w:r>
+          </w:p>
+        </w:tc>
+        <w:tc>
+          <w:tcPr>
+            <w:tcW w:w="1795" w:type="dxa"/>
+          </w:tcPr>
+          <w:p>
+            <w:pPr>
+              <w:pStyle w:val="TableParagraph"/>
+              <w:rPr>
+                <w:sz w:val="24"/>
+              </w:rPr>
+            </w:pPr>
+            <w:r>
+              <w:t>PO7</w:t>
+            </w:r>
+          </w:p>
+        </w:tc>
+        <w:tc>
+          <w:tcPr>
+            <w:tcW w:w="1795" w:type="dxa"/>
+          </w:tcPr>
+          <w:p>
+            <w:pPr>
+              <w:pStyle w:val="TableParagraph"/>
+              <w:rPr>
+                <w:sz w:val="24"/>
+              </w:rPr>
+            </w:pPr>
+            <w:r>
+              <w:t>Analyze/Evaluate</w:t>
+            </w:r>
+          </w:p>
+        </w:tc>
+        <w:tc>
+          <w:tcPr>
+            <w:tcW w:w="1795" w:type="dxa"/>
+          </w:tcPr>
+          <w:p>
+            <w:pPr>
+              <w:pStyle w:val="TableParagraph"/>
+              <w:rPr>
+                <w:sz w:val="24"/>
+              </w:rPr>
+            </w:pPr>
+            <w:r>
+              <w:t>5</w:t>
+            </w:r>
+          </w:p>
+        </w:tc>
+      </w:tr>
+      <w:tr>
+        <w:tc>
+          <w:tcPr>
+            <w:tcW w:w="1794" w:type="dxa"/>
+          </w:tcPr>
+          <w:p>
+            <w:pPr>
+              <w:pStyle w:val="TableParagraph"/>
+              <w:rPr>
+                <w:sz w:val="24"/>
+              </w:rPr>
+            </w:pPr>
+            <w:r>
+              <w:t>Q8</w:t>
+            </w:r>
+          </w:p>
+        </w:tc>
+        <w:tc>
+          <w:tcPr>
+            <w:tcW w:w="1794" w:type="dxa"/>
+          </w:tcPr>
+          <w:p>
+            <w:pPr>
+              <w:pStyle w:val="TableParagraph"/>
+              <w:rPr>
+                <w:sz w:val="24"/>
+              </w:rPr>
+            </w:pPr>
+            <w:r>
+              <w:t>Question from Unit 3</w:t>
+            </w:r>
+          </w:p>
+        </w:tc>
+        <w:tc>
+          <w:tcPr>
+            <w:tcW w:w="1794" w:type="dxa"/>
+          </w:tcPr>
+          <w:p>
+            <w:pPr>
+              <w:pStyle w:val="TableParagraph"/>
+              <w:rPr>
+                <w:sz w:val="24"/>
+              </w:rPr>
+            </w:pPr>
+            <w:r>
+              <w:t>CO2</w:t>
+            </w:r>
+          </w:p>
+        </w:tc>
+        <w:tc>
+          <w:tcPr>
+            <w:tcW w:w="1795" w:type="dxa"/>
+          </w:tcPr>
+          <w:p>
+            <w:pPr>
+              <w:pStyle w:val="TableParagraph"/>
+              <w:rPr>
+                <w:sz w:val="24"/>
+              </w:rPr>
+            </w:pPr>
+            <w:r>
+              <w:t>PO8</w:t>
+            </w:r>
+          </w:p>
+        </w:tc>
+        <w:tc>
+          <w:tcPr>
+            <w:tcW w:w="1795" w:type="dxa"/>
+          </w:tcPr>
+          <w:p>
+            <w:pPr>
+              <w:pStyle w:val="TableParagraph"/>
+              <w:rPr>
+                <w:sz w:val="24"/>
+              </w:rPr>
+            </w:pPr>
+            <w:r>
+              <w:t>Analyze/Evaluate</w:t>
+            </w:r>
+          </w:p>
+        </w:tc>
+        <w:tc>
+          <w:tcPr>
+            <w:tcW w:w="1795" w:type="dxa"/>
+          </w:tcPr>
+          <w:p>
+            <w:pPr>
+              <w:pStyle w:val="TableParagraph"/>
+              <w:rPr>
+                <w:sz w:val="24"/>
+              </w:rPr>
+            </w:pPr>
+            <w:r>
+              <w:t>5</w:t>
+            </w:r>
+          </w:p>
+        </w:tc>
+      </w:tr>
+      <w:tr>
+        <w:tc>
+          <w:tcPr>
+            <w:tcW w:w="1794" w:type="dxa"/>
+          </w:tcPr>
+          <w:p>
+            <w:pPr>
+              <w:pStyle w:val="TableParagraph"/>
+              <w:rPr>
+                <w:sz w:val="24"/>
+              </w:rPr>
+            </w:pPr>
+            <w:r>
+              <w:t>Q9</w:t>
+            </w:r>
+          </w:p>
+        </w:tc>
+        <w:tc>
+          <w:tcPr>
+            <w:tcW w:w="1794" w:type="dxa"/>
+          </w:tcPr>
+          <w:p>
+            <w:pPr>
+              <w:pStyle w:val="TableParagraph"/>
+              <w:rPr>
+                <w:sz w:val="24"/>
+              </w:rPr>
+            </w:pPr>
+            <w:r>
+              <w:t>Question from Unit 3</w:t>
+            </w:r>
+          </w:p>
+        </w:tc>
+        <w:tc>
+          <w:tcPr>
+            <w:tcW w:w="1794" w:type="dxa"/>
+          </w:tcPr>
+          <w:p>
+            <w:pPr>
+              <w:pStyle w:val="TableParagraph"/>
+              <w:rPr>
+                <w:sz w:val="24"/>
+              </w:rPr>
+            </w:pPr>
+            <w:r>
+              <w:t>CO3</w:t>
+            </w:r>
+          </w:p>
+        </w:tc>
+        <w:tc>
+          <w:tcPr>
+            <w:tcW w:w="1795" w:type="dxa"/>
+          </w:tcPr>
+          <w:p>
+            <w:pPr>
+              <w:pStyle w:val="TableParagraph"/>
+              <w:rPr>
+                <w:sz w:val="24"/>
+              </w:rPr>
+            </w:pPr>
+            <w:r>
+              <w:t>PO9</w:t>
+            </w:r>
+          </w:p>
+        </w:tc>
+        <w:tc>
+          <w:tcPr>
+            <w:tcW w:w="1795" w:type="dxa"/>
+          </w:tcPr>
+          <w:p>
+            <w:pPr>
+              <w:pStyle w:val="TableParagraph"/>
+              <w:rPr>
+                <w:sz w:val="24"/>
+              </w:rPr>
+            </w:pPr>
+            <w:r>
+              <w:t>Analyze/Evaluate</w:t>
+            </w:r>
+          </w:p>
+        </w:tc>
+        <w:tc>
+          <w:tcPr>
+            <w:tcW w:w="1795" w:type="dxa"/>
+          </w:tcPr>
+          <w:p>
+            <w:pPr>
+              <w:pStyle w:val="TableParagraph"/>
+              <w:rPr>
+                <w:sz w:val="24"/>
+              </w:rPr>
+            </w:pPr>
+            <w:r>
+              <w:t>5</w:t>
+            </w:r>
+          </w:p>
+        </w:tc>
+      </w:tr>
+    </w:tbl>
+    <w:p>
+      <w:pPr>
+        <w:pStyle w:val="TableParagraph"/>
+        <w:rPr>
+          <w:sz w:val="24"/>
+        </w:rPr>
+      </w:pPr>
+    </w:p>
+    <w:p>
+      <w:pPr>
+        <w:pStyle w:val="TableParagraph"/>
+        <w:rPr>
+          <w:sz w:val="24"/>
+        </w:rPr>
+      </w:pPr>
+    </w:p>
+    <w:p>
+      <w:pPr>
+        <w:pStyle w:val="TableParagraph"/>
+        <w:rPr>
+          <w:sz w:val="24"/>
+        </w:rPr>
+      </w:pPr>
+    </w:p>
+    <w:p>
+      <w:pPr>
+        <w:pStyle w:val="TableParagraph"/>
+        <w:rPr>
+          <w:sz w:val="24"/>
+        </w:rPr>
+      </w:pPr>
+    </w:p>
+    <w:p>
+      <w:pPr>
+        <w:pStyle w:val="TableParagraph"/>
+        <w:rPr>
+          <w:sz w:val="24"/>
+        </w:rPr>
+      </w:pPr>
+      <w:r>
+        <w:rPr>
+          <w:sz w:val="24"/>
+        </w:rPr>
+        <w:t xml:space="preserve">SECTION </w:t>
       </w:r>
       <w:r>
         <w:rPr>
           <w:sz w:val="24"/>
         </w:rPr>
-        <w:br/>
+        <w:t>D</w:t>
       </w:r>
       <w:r>
         <w:rPr>
           <w:sz w:val="24"/>
         </w:rPr>
-        <w:br/>
-        <w:t>{{SECTION_B_Q1}}</w:t>
+        <w:t xml:space="preserve"> – Unit </w:t>
       </w:r>
       <w:r>
         <w:rPr>
           <w:sz w:val="24"/>
         </w:rPr>
-        <w:br/>
-        <w:t>{{SECTION_B_Q2}}</w:t>
+        <w:t>4</w:t>
       </w:r>
       <w:r>
         <w:rPr>
           <w:sz w:val="24"/>
         </w:rPr>
-        <w:br/>
-        <w:t>{{SECTION_B_Q3}}</w:t>
+        <w:t xml:space="preserve"> [Solve Any Two]</w:t>
+      </w:r>
+    </w:p>
+    <w:p>
+      <w:pPr>
+        <w:pStyle w:val="TableParagraph"/>
+        <w:rPr>
+          <w:sz w:val="24"/>
+        </w:rPr>
+      </w:pPr>
+    </w:p>
+    <w:tbl>
+      <w:tblPr>
+        <w:tblStyle w:val="TableGrid"/>
+        <w:tblW w:w="0" w:type="auto"/>
+        <w:tblLook w:val="04A0" w:firstRow="1" w:lastRow="0" w:firstColumn="1" w:lastColumn="0" w:noHBand="0" w:noVBand="1"/>
+      </w:tblPr>
+      <w:tblGrid>
+        <w:gridCol w:w="1794"/>
+        <w:gridCol w:w="1794"/>
+        <w:gridCol w:w="1794"/>
+        <w:gridCol w:w="1795"/>
+        <w:gridCol w:w="1795"/>
+        <w:gridCol w:w="1795"/>
+      </w:tblGrid>
+      <w:tr>
+        <w:tc>
+          <w:tcPr>
+            <w:tcW w:w="1794" w:type="dxa"/>
+          </w:tcPr>
+          <w:p>
+            <w:pPr>
+              <w:pStyle w:val="TableParagraph"/>
+              <w:rPr>
+                <w:sz w:val="24"/>
+              </w:rPr>
+            </w:pPr>
+            <w:r>
+              <w:t>Q</w:t>
+            </w:r>
+            <w:r>
+              <w:t>10</w:t>
+            </w:r>
+          </w:p>
+        </w:tc>
+        <w:tc>
+          <w:tcPr>
+            <w:tcW w:w="1794" w:type="dxa"/>
+          </w:tcPr>
+          <w:p>
+            <w:pPr>
+              <w:pStyle w:val="TableParagraph"/>
+              <w:rPr>
+                <w:sz w:val="24"/>
+              </w:rPr>
+            </w:pPr>
+            <w:r>
+              <w:t>Question from Unit 4</w:t>
+            </w:r>
+          </w:p>
+        </w:tc>
+        <w:tc>
+          <w:tcPr>
+            <w:tcW w:w="1794" w:type="dxa"/>
+          </w:tcPr>
+          <w:p>
+            <w:pPr>
+              <w:pStyle w:val="TableParagraph"/>
+              <w:rPr>
+                <w:sz w:val="24"/>
+              </w:rPr>
+            </w:pPr>
+            <w:r>
+              <w:t>CO4</w:t>
+            </w:r>
+          </w:p>
+        </w:tc>
+        <w:tc>
+          <w:tcPr>
+            <w:tcW w:w="1795" w:type="dxa"/>
+          </w:tcPr>
+          <w:p>
+            <w:pPr>
+              <w:pStyle w:val="TableParagraph"/>
+              <w:rPr>
+                <w:sz w:val="24"/>
+              </w:rPr>
+            </w:pPr>
+            <w:r>
+              <w:t>PO10</w:t>
+            </w:r>
+          </w:p>
+        </w:tc>
+        <w:tc>
+          <w:tcPr>
+            <w:tcW w:w="1795" w:type="dxa"/>
+          </w:tcPr>
+          <w:p>
+            <w:pPr>
+              <w:pStyle w:val="TableParagraph"/>
+              <w:rPr>
+                <w:sz w:val="24"/>
+              </w:rPr>
+            </w:pPr>
+            <w:r>
+              <w:t>Analyze/Evaluate</w:t>
+            </w:r>
+          </w:p>
+        </w:tc>
+        <w:tc>
+          <w:tcPr>
+            <w:tcW w:w="1795" w:type="dxa"/>
+          </w:tcPr>
+          <w:p>
+            <w:pPr>
+              <w:pStyle w:val="TableParagraph"/>
+              <w:rPr>
+                <w:sz w:val="24"/>
+              </w:rPr>
+            </w:pPr>
+            <w:r>
+              <w:t>5</w:t>
+            </w:r>
+          </w:p>
+        </w:tc>
+      </w:tr>
+      <w:tr>
+        <w:tc>
+          <w:tcPr>
+            <w:tcW w:w="1794" w:type="dxa"/>
+          </w:tcPr>
+          <w:p>
+            <w:pPr>
+              <w:pStyle w:val="TableParagraph"/>
+              <w:rPr>
+                <w:sz w:val="24"/>
+              </w:rPr>
+            </w:pPr>
+            <w:r>
+              <w:t>Q11</w:t>
+            </w:r>
+          </w:p>
+        </w:tc>
+        <w:tc>
+          <w:tcPr>
+            <w:tcW w:w="1794" w:type="dxa"/>
+          </w:tcPr>
+          <w:p>
+            <w:pPr>
+              <w:pStyle w:val="TableParagraph"/>
+              <w:rPr>
+                <w:sz w:val="24"/>
+              </w:rPr>
+            </w:pPr>
+            <w:r>
+              <w:t>Question from Unit 4</w:t>
+            </w:r>
+          </w:p>
+        </w:tc>
+        <w:tc>
+          <w:tcPr>
+            <w:tcW w:w="1794" w:type="dxa"/>
+          </w:tcPr>
+          <w:p>
+            <w:pPr>
+              <w:pStyle w:val="TableParagraph"/>
+              <w:rPr>
+                <w:sz w:val="24"/>
+              </w:rPr>
+            </w:pPr>
+            <w:r>
+              <w:t>CO5</w:t>
+            </w:r>
+          </w:p>
+        </w:tc>
+        <w:tc>
+          <w:tcPr>
+            <w:tcW w:w="1795" w:type="dxa"/>
+          </w:tcPr>
+          <w:p>
+            <w:pPr>
+              <w:pStyle w:val="TableParagraph"/>
+              <w:rPr>
+                <w:sz w:val="24"/>
+              </w:rPr>
+            </w:pPr>
+            <w:r>
+              <w:t>PO11</w:t>
+            </w:r>
+          </w:p>
+        </w:tc>
+        <w:tc>
+          <w:tcPr>
+            <w:tcW w:w="1795" w:type="dxa"/>
+          </w:tcPr>
+          <w:p>
+            <w:pPr>
+              <w:pStyle w:val="TableParagraph"/>
+              <w:rPr>
+                <w:sz w:val="24"/>
+              </w:rPr>
+            </w:pPr>
+            <w:r>
+              <w:t>Analyze/Evaluate</w:t>
+            </w:r>
+          </w:p>
+        </w:tc>
+        <w:tc>
+          <w:tcPr>
+            <w:tcW w:w="1795" w:type="dxa"/>
+          </w:tcPr>
+          <w:p>
+            <w:pPr>
+              <w:pStyle w:val="TableParagraph"/>
+              <w:rPr>
+                <w:sz w:val="24"/>
+              </w:rPr>
+            </w:pPr>
+            <w:r>
+              <w:t>5</w:t>
+            </w:r>
+          </w:p>
+        </w:tc>
+      </w:tr>
+      <w:tr>
+        <w:tc>
+          <w:tcPr>
+            <w:tcW w:w="1794" w:type="dxa"/>
+          </w:tcPr>
+          <w:p>
+            <w:pPr>
+              <w:pStyle w:val="TableParagraph"/>
+              <w:rPr>
+                <w:sz w:val="24"/>
+              </w:rPr>
+            </w:pPr>
+            <w:r>
+              <w:t>Q12</w:t>
+            </w:r>
+          </w:p>
+        </w:tc>
+        <w:tc>
+          <w:tcPr>
+            <w:tcW w:w="1794" w:type="dxa"/>
+          </w:tcPr>
+          <w:p>
+            <w:pPr>
+              <w:pStyle w:val="TableParagraph"/>
+              <w:rPr>
+                <w:sz w:val="24"/>
+              </w:rPr>
+            </w:pPr>
+            <w:r>
+              <w:t>Question from Unit 4</w:t>
+            </w:r>
+          </w:p>
+        </w:tc>
+        <w:tc>
+          <w:tcPr>
+            <w:tcW w:w="1794" w:type="dxa"/>
+          </w:tcPr>
+          <w:p>
+            <w:pPr>
+              <w:pStyle w:val="TableParagraph"/>
+              <w:rPr>
+                <w:sz w:val="24"/>
+              </w:rPr>
+            </w:pPr>
+            <w:r>
+              <w:t>CO6</w:t>
+            </w:r>
+          </w:p>
+        </w:tc>
+        <w:tc>
+          <w:tcPr>
+            <w:tcW w:w="1795" w:type="dxa"/>
+          </w:tcPr>
+          <w:p>
+            <w:pPr>
+              <w:pStyle w:val="TableParagraph"/>
+              <w:rPr>
+                <w:sz w:val="24"/>
+              </w:rPr>
+            </w:pPr>
+            <w:r>
+              <w:t>PO12</w:t>
+            </w:r>
+          </w:p>
+        </w:tc>
+        <w:tc>
+          <w:tcPr>
+            <w:tcW w:w="1795" w:type="dxa"/>
+          </w:tcPr>
+          <w:p>
+            <w:pPr>
+              <w:pStyle w:val="TableParagraph"/>
+              <w:rPr>
+                <w:sz w:val="24"/>
+              </w:rPr>
+            </w:pPr>
+            <w:r>
+              <w:t>Analyze/Evaluate</w:t>
+            </w:r>
+          </w:p>
+        </w:tc>
+        <w:tc>
+          <w:tcPr>
+            <w:tcW w:w="1795" w:type="dxa"/>
+          </w:tcPr>
+          <w:p>
+            <w:pPr>
+              <w:pStyle w:val="TableParagraph"/>
+              <w:rPr>
+                <w:sz w:val="24"/>
+              </w:rPr>
+            </w:pPr>
+            <w:r>
+              <w:t>5</w:t>
+            </w:r>
+          </w:p>
+        </w:tc>
+      </w:tr>
+    </w:tbl>
+    <w:p>
+      <w:pPr>
+        <w:pStyle w:val="TableParagraph"/>
+        <w:rPr>
+          <w:sz w:val="24"/>
+        </w:rPr>
+      </w:pPr>
+    </w:p>
+    <w:p>
+      <w:pPr>
+        <w:pStyle w:val="TableParagraph"/>
+        <w:rPr>
+          <w:sz w:val="24"/>
+        </w:rPr>
+      </w:pPr>
+    </w:p>
+    <w:p>
+      <w:pPr>
+        <w:pStyle w:val="TableParagraph"/>
+        <w:rPr>
+          <w:sz w:val="24"/>
+        </w:rPr>
+      </w:pPr>
+      <w:r>
+        <w:rPr>
+          <w:sz w:val="24"/>
+        </w:rPr>
+        <w:t xml:space="preserve">SECTION </w:t>
       </w:r>
       <w:r>
         <w:rPr>
           <w:sz w:val="24"/>
         </w:rPr>
-        <w:br/>
+        <w:t>E</w:t>
       </w:r>
       <w:r>
         <w:rPr>
           <w:sz w:val="24"/>
         </w:rPr>
-        <w:br/>
-        <w:t>SECTION C – Unit 3</w:t>
+        <w:t xml:space="preserve"> – Unit </w:t>
       </w:r>
       <w:r>
         <w:rPr>
           <w:sz w:val="24"/>
         </w:rPr>
-        <w:br/>
-        <w:t>(5 Marks Each) [Solve Any Two]</w:t>
+        <w:t>5</w:t>
       </w:r>
       <w:r>
         <w:rPr>
           <w:sz w:val="24"/>
         </w:rPr>
-        <w:br/>
-      </w:r>
-      <w:r>
-        <w:rPr>
-          <w:sz w:val="24"/>
-        </w:rPr>
-        <w:br/>
-        <w:t>{{SECTION_C_Q1}}</w:t>
-      </w:r>
-      <w:r>
-        <w:rPr>
-          <w:sz w:val="24"/>
-        </w:rPr>
-        <w:br/>
-        <w:t>{{SECTION_C_Q2}}</w:t>
-      </w:r>
-      <w:r>
-        <w:rPr>
-          <w:sz w:val="24"/>
-        </w:rPr>
-        <w:br/>
-        <w:t>{{SECTION_C_Q3}}</w:t>
-      </w:r>
-      <w:r>
-        <w:rPr>
-          <w:sz w:val="24"/>
-        </w:rPr>
-        <w:br/>
-      </w:r>
-      <w:r>
-        <w:rPr>
-          <w:sz w:val="24"/>
-        </w:rPr>
-        <w:br/>
-        <w:t>SECTION D – Unit 4</w:t>
-      </w:r>
-      <w:r>
-        <w:rPr>
-          <w:sz w:val="24"/>
-        </w:rPr>
-        <w:br/>
-        <w:t>(5 Marks Each) [Solve Any Two]</w:t>
-      </w:r>
-      <w:r>
-        <w:rPr>
-          <w:sz w:val="24"/>
-        </w:rPr>
-        <w:br/>
-      </w:r>
-      <w:r>
-        <w:rPr>
-          <w:sz w:val="24"/>
-        </w:rPr>
-        <w:br/>
-        <w:t>{{SECTION_D_Q1}}</w:t>
-      </w:r>
-      <w:r>
-        <w:rPr>
-          <w:sz w:val="24"/>
-        </w:rPr>
-        <w:br/>
-        <w:t>{{SECTION_D_Q2}}</w:t>
-      </w:r>
-      <w:r>
-        <w:rPr>
-          <w:sz w:val="24"/>
-        </w:rPr>
-        <w:br/>
-        <w:t>{{SECTION_D_Q3}}</w:t>
-      </w:r>
-      <w:r>
-        <w:rPr>
-          <w:sz w:val="24"/>
-        </w:rPr>
-        <w:br/>
-      </w:r>
-      <w:r>
-        <w:rPr>
-          <w:sz w:val="24"/>
-        </w:rPr>
-        <w:lastRenderedPageBreak/>
-        <w:br/>
-        <w:t>SECTION E – Unit 5</w:t>
-      </w:r>
-      <w:r>
-        <w:rPr>
-          <w:sz w:val="24"/>
-        </w:rPr>
-        <w:br/>
-        <w:t>(10 Marks Each) [Solve Any One]</w:t>
-      </w:r>
-      <w:r>
-        <w:rPr>
-          <w:sz w:val="24"/>
-        </w:rPr>
-        <w:br/>
-      </w:r>
-      <w:r>
-        <w:rPr>
-          <w:sz w:val="24"/>
-        </w:rPr>
-        <w:br/>
-        <w:t>{{SECTION_E_Q1}}</w:t>
-      </w:r>
-      <w:r>
-        <w:rPr>
-          <w:sz w:val="24"/>
-        </w:rPr>
-        <w:br/>
-        <w:t>{{SECTION_E_Q2}}</w:t>
+        <w:t xml:space="preserve"> [Solve Any Two]</w:t>
       </w:r>
     </w:p>
     <w:p>
@@ -1492,225 +2818,512 @@
         <w:rPr>
           <w:sz w:val="24"/>
         </w:rPr>
-        <w:sectPr>
-          <w:footerReference w:type="default" r:id="rId7"/>
-          <w:type w:val="continuous"/>
-          <w:pgSz w:w="11910" w:h="16840"/>
-          <w:pgMar w:top="1400" w:right="425" w:bottom="1200" w:left="708" w:header="0" w:footer="1000" w:gutter="0"/>
-          <w:cols w:space="720"/>
-        </w:sectPr>
       </w:pPr>
-      <w:r>
+    </w:p>
+    <w:tbl>
+      <w:tblPr>
+        <w:tblStyle w:val="TableGrid"/>
+        <w:tblW w:w="0" w:type="auto"/>
+        <w:tblLook w:val="04A0" w:firstRow="1" w:lastRow="0" w:firstColumn="1" w:lastColumn="0" w:noHBand="0" w:noVBand="1"/>
+      </w:tblPr>
+      <w:tblGrid>
+        <w:gridCol w:w="1794"/>
+        <w:gridCol w:w="1794"/>
+        <w:gridCol w:w="1794"/>
+        <w:gridCol w:w="1795"/>
+        <w:gridCol w:w="1795"/>
+        <w:gridCol w:w="1795"/>
+      </w:tblGrid>
+      <w:tr>
+        <w:tc>
+          <w:tcPr>
+            <w:tcW w:w="1794" w:type="dxa"/>
+          </w:tcPr>
+          <w:p>
+            <w:pPr>
+              <w:pStyle w:val="TableParagraph"/>
+              <w:rPr>
+                <w:sz w:val="24"/>
+              </w:rPr>
+            </w:pPr>
+            <w:r>
+              <w:t>Q13</w:t>
+            </w:r>
+          </w:p>
+        </w:tc>
+        <w:tc>
+          <w:tcPr>
+            <w:tcW w:w="1794" w:type="dxa"/>
+          </w:tcPr>
+          <w:p>
+            <w:pPr>
+              <w:pStyle w:val="TableParagraph"/>
+              <w:rPr>
+                <w:sz w:val="24"/>
+              </w:rPr>
+            </w:pPr>
+            <w:r>
+              <w:t>Long answer question</w:t>
+            </w:r>
+          </w:p>
+        </w:tc>
+        <w:tc>
+          <w:tcPr>
+            <w:tcW w:w="1794" w:type="dxa"/>
+          </w:tcPr>
+          <w:p>
+            <w:pPr>
+              <w:pStyle w:val="TableParagraph"/>
+              <w:rPr>
+                <w:sz w:val="24"/>
+              </w:rPr>
+            </w:pPr>
+            <w:r>
+              <w:t>CO1</w:t>
+            </w:r>
+          </w:p>
+        </w:tc>
+        <w:tc>
+          <w:tcPr>
+            <w:tcW w:w="1795" w:type="dxa"/>
+          </w:tcPr>
+          <w:p>
+            <w:pPr>
+              <w:pStyle w:val="TableParagraph"/>
+              <w:rPr>
+                <w:sz w:val="24"/>
+              </w:rPr>
+            </w:pPr>
+            <w:r>
+              <w:t>PO1</w:t>
+            </w:r>
+          </w:p>
+        </w:tc>
+        <w:tc>
+          <w:tcPr>
+            <w:tcW w:w="1795" w:type="dxa"/>
+          </w:tcPr>
+          <w:p>
+            <w:pPr>
+              <w:pStyle w:val="TableParagraph"/>
+              <w:rPr>
+                <w:sz w:val="24"/>
+              </w:rPr>
+            </w:pPr>
+            <w:r>
+              <w:t>Analyze/Evaluate</w:t>
+            </w:r>
+          </w:p>
+        </w:tc>
+        <w:tc>
+          <w:tcPr>
+            <w:tcW w:w="1795" w:type="dxa"/>
+          </w:tcPr>
+          <w:p>
+            <w:pPr>
+              <w:pStyle w:val="TableParagraph"/>
+              <w:rPr>
+                <w:sz w:val="24"/>
+              </w:rPr>
+            </w:pPr>
+            <w:r>
+              <w:t>10</w:t>
+            </w:r>
+          </w:p>
+        </w:tc>
+      </w:tr>
+      <w:tr>
+        <w:tc>
+          <w:tcPr>
+            <w:tcW w:w="1794" w:type="dxa"/>
+          </w:tcPr>
+          <w:p>
+            <w:pPr>
+              <w:pStyle w:val="TableParagraph"/>
+              <w:rPr>
+                <w:sz w:val="24"/>
+              </w:rPr>
+            </w:pPr>
+            <w:r>
+              <w:t>Q14</w:t>
+            </w:r>
+          </w:p>
+        </w:tc>
+        <w:tc>
+          <w:tcPr>
+            <w:tcW w:w="1794" w:type="dxa"/>
+          </w:tcPr>
+          <w:p>
+            <w:pPr>
+              <w:pStyle w:val="TableParagraph"/>
+              <w:rPr>
+                <w:sz w:val="24"/>
+              </w:rPr>
+            </w:pPr>
+            <w:r>
+              <w:t>Long answer question</w:t>
+            </w:r>
+          </w:p>
+        </w:tc>
+        <w:tc>
+          <w:tcPr>
+            <w:tcW w:w="1794" w:type="dxa"/>
+          </w:tcPr>
+          <w:p>
+            <w:pPr>
+              <w:pStyle w:val="TableParagraph"/>
+              <w:rPr>
+                <w:sz w:val="24"/>
+              </w:rPr>
+            </w:pPr>
+            <w:r>
+              <w:t>CO2</w:t>
+            </w:r>
+          </w:p>
+        </w:tc>
+        <w:tc>
+          <w:tcPr>
+            <w:tcW w:w="1795" w:type="dxa"/>
+          </w:tcPr>
+          <w:p>
+            <w:pPr>
+              <w:pStyle w:val="TableParagraph"/>
+              <w:rPr>
+                <w:sz w:val="24"/>
+              </w:rPr>
+            </w:pPr>
+            <w:r>
+              <w:t>PO2</w:t>
+            </w:r>
+          </w:p>
+        </w:tc>
+        <w:tc>
+          <w:tcPr>
+            <w:tcW w:w="1795" w:type="dxa"/>
+          </w:tcPr>
+          <w:p>
+            <w:pPr>
+              <w:pStyle w:val="TableParagraph"/>
+              <w:rPr>
+                <w:sz w:val="24"/>
+              </w:rPr>
+            </w:pPr>
+            <w:r>
+              <w:t>Analyze/Evaluate</w:t>
+            </w:r>
+          </w:p>
+        </w:tc>
+        <w:tc>
+          <w:tcPr>
+            <w:tcW w:w="1795" w:type="dxa"/>
+          </w:tcPr>
+          <w:p>
+            <w:pPr>
+              <w:pStyle w:val="TableParagraph"/>
+              <w:rPr>
+                <w:sz w:val="24"/>
+              </w:rPr>
+            </w:pPr>
+            <w:r>
+              <w:t>10</w:t>
+            </w:r>
+          </w:p>
+        </w:tc>
+      </w:tr>
+    </w:tbl>
+    <w:p>
+      <w:pPr>
+        <w:pStyle w:val="TableParagraph"/>
         <w:rPr>
           <w:sz w:val="24"/>
         </w:rPr>
-        <w:br w:type="textWrapping" w:clear="all"/>
-      </w:r>
+      </w:pPr>
     </w:p>
     <w:p>
       <w:pPr>
-        <w:spacing w:line="20" w:lineRule="exact"/>
-        <w:ind w:left="396" w:right="-44"/>
+        <w:pStyle w:val="TableParagraph"/>
+        <w:jc w:val="center"/>
+        <w:rPr>
+          <w:sz w:val="24"/>
+        </w:rPr>
+      </w:pPr>
+    </w:p>
+    <w:p>
+      <w:pPr>
+        <w:pStyle w:val="TableParagraph"/>
+        <w:jc w:val="center"/>
+        <w:rPr>
+          <w:sz w:val="24"/>
+        </w:rPr>
+      </w:pPr>
+    </w:p>
+    <w:p>
+      <w:pPr>
+        <w:pStyle w:val="TableParagraph"/>
+        <w:jc w:val="center"/>
+        <w:rPr>
+          <w:sz w:val="24"/>
+        </w:rPr>
+      </w:pPr>
+    </w:p>
+    <w:p>
+      <w:pPr>
+        <w:pStyle w:val="TableParagraph"/>
+        <w:jc w:val="center"/>
+        <w:rPr>
+          <w:sz w:val="24"/>
+        </w:rPr>
+      </w:pPr>
+    </w:p>
+    <w:p>
+      <w:pPr>
+        <w:pStyle w:val="TableParagraph"/>
+        <w:jc w:val="center"/>
+        <w:rPr>
+          <w:sz w:val="24"/>
+        </w:rPr>
+      </w:pPr>
+    </w:p>
+    <w:p>
+      <w:pPr>
+        <w:pStyle w:val="TableParagraph"/>
+        <w:jc w:val="center"/>
+        <w:rPr>
+          <w:sz w:val="24"/>
+        </w:rPr>
+      </w:pPr>
+    </w:p>
+    <w:p>
+      <w:pPr>
         <w:rPr>
           <w:rFonts w:ascii="Times New Roman"/>
-          <w:sz w:val="2"/>
+          <w:sz w:val="20"/>
         </w:rPr>
       </w:pPr>
-      <w:r>
+    </w:p>
+    <w:p>
+      <w:pPr>
         <w:rPr>
           <w:rFonts w:ascii="Times New Roman"/>
-          <w:noProof/>
-          <w:sz w:val="2"/>
-        </w:rPr>
-        <w:lastRenderedPageBreak/>
-        <mc:AlternateContent>
-          <mc:Choice Requires="wps">
-            <w:drawing>
-              <wp:anchor distT="0" distB="0" distL="0" distR="0" simplePos="0" relativeHeight="15729152" behindDoc="0" locked="0" layoutInCell="1" allowOverlap="1" wp14:anchorId="571E1AAB" wp14:editId="38F20643">
-                <wp:simplePos x="0" y="0"/>
-                <wp:positionH relativeFrom="page">
-                  <wp:posOffset>1256080</wp:posOffset>
-                </wp:positionH>
-                <wp:positionV relativeFrom="page">
-                  <wp:posOffset>9692640</wp:posOffset>
-                </wp:positionV>
-                <wp:extent cx="5410200" cy="264160"/>
-                <wp:effectExtent l="0" t="0" r="0" b="0"/>
-                <wp:wrapNone/>
-                <wp:docPr id="3" name="Graphic 3"/>
-                <wp:cNvGraphicFramePr>
-                  <a:graphicFrameLocks xmlns:a="http://schemas.openxmlformats.org/drawingml/2006/main"/>
-                </wp:cNvGraphicFramePr>
-                <a:graphic xmlns:a="http://schemas.openxmlformats.org/drawingml/2006/main">
-                  <a:graphicData uri="http://schemas.microsoft.com/office/word/2010/wordprocessingShape">
-                    <wps:wsp>
-                      <wps:cNvSpPr>
-                        <a:spLocks/>
-                      </wps:cNvSpPr>
-                      <wps:spPr>
-                        <a:xfrm>
-                          <a:off x="0" y="0"/>
-                          <a:ext cx="5410200" cy="264160"/>
-                        </a:xfrm>
-                        <a:custGeom>
-                          <a:avLst/>
-                          <a:gdLst/>
-                          <a:ahLst/>
-                          <a:cxnLst/>
-                          <a:rect l="l" t="t" r="r" b="b"/>
-                          <a:pathLst>
-                            <a:path w="5410200" h="264160">
-                              <a:moveTo>
-                                <a:pt x="5409946" y="0"/>
-                              </a:moveTo>
-                              <a:lnTo>
-                                <a:pt x="0" y="0"/>
-                              </a:lnTo>
-                              <a:lnTo>
-                                <a:pt x="0" y="263652"/>
-                              </a:lnTo>
-                              <a:lnTo>
-                                <a:pt x="5409946" y="263652"/>
-                              </a:lnTo>
-                              <a:lnTo>
-                                <a:pt x="5409946" y="0"/>
-                              </a:lnTo>
-                              <a:close/>
-                            </a:path>
-                          </a:pathLst>
-                        </a:custGeom>
-                        <a:solidFill>
-                          <a:srgbClr val="FFFFFF"/>
-                        </a:solidFill>
-                      </wps:spPr>
-                      <wps:bodyPr wrap="square" lIns="0" tIns="0" rIns="0" bIns="0" rtlCol="0">
-                        <a:prstTxWarp prst="textNoShape">
-                          <a:avLst/>
-                        </a:prstTxWarp>
-                        <a:noAutofit/>
-                      </wps:bodyPr>
-                    </wps:wsp>
-                  </a:graphicData>
-                </a:graphic>
-              </wp:anchor>
-            </w:drawing>
-          </mc:Choice>
-          <mc:Fallback>
-            <w:pict>
-              <v:shape w14:anchorId="3E385D98" id="Graphic 3" o:spid="_x0000_s1026" style="position:absolute;margin-left:98.9pt;margin-top:763.2pt;width:426pt;height:20.8pt;z-index:15729152;visibility:visible;mso-wrap-style:square;mso-wrap-distance-left:0;mso-wrap-distance-top:0;mso-wrap-distance-right:0;mso-wrap-distance-bottom:0;mso-position-horizontal:absolute;mso-position-horizontal-relative:page;mso-position-vertical:absolute;mso-position-vertical-relative:page;v-text-anchor:top" coordsize="5410200,264160" o:gfxdata="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" path="m5409946,l,,,263652r5409946,l5409946,xe" stroked="f">
-                <v:path arrowok="t"/>
-                <w10:wrap anchorx="page" anchory="page"/>
-              </v:shape>
-            </w:pict>
-          </mc:Fallback>
-        </mc:AlternateContent>
-      </w:r>
-      <w:r>
+          <w:sz w:val="20"/>
+        </w:rPr>
+      </w:pPr>
+    </w:p>
+    <w:p>
+      <w:pPr>
         <w:rPr>
           <w:rFonts w:ascii="Times New Roman"/>
-          <w:noProof/>
-          <w:sz w:val="2"/>
-        </w:rPr>
-        <mc:AlternateContent>
-          <mc:Choice Requires="wpg">
-            <w:drawing>
-              <wp:inline distT="0" distB="0" distL="0" distR="0" wp14:anchorId="37E700A5" wp14:editId="34109EA5">
-                <wp:extent cx="6572884" cy="6350"/>
-                <wp:effectExtent l="0" t="0" r="0" b="0"/>
-                <wp:docPr id="4" name="Group 4"/>
-                <wp:cNvGraphicFramePr>
-                  <a:graphicFrameLocks xmlns:a="http://schemas.openxmlformats.org/drawingml/2006/main"/>
-                </wp:cNvGraphicFramePr>
-                <a:graphic xmlns:a="http://schemas.openxmlformats.org/drawingml/2006/main">
-                  <a:graphicData uri="http://schemas.microsoft.com/office/word/2010/wordprocessingGroup">
-                    <wpg:wgp>
-                      <wpg:cNvGrpSpPr>
-                        <a:grpSpLocks/>
-                      </wpg:cNvGrpSpPr>
-                      <wpg:grpSpPr>
-                        <a:xfrm>
-                          <a:off x="0" y="0"/>
-                          <a:ext cx="6572884" cy="6350"/>
-                          <a:chOff x="0" y="0"/>
-                          <a:chExt cx="6572884" cy="6350"/>
-                        </a:xfrm>
-                      </wpg:grpSpPr>
-                      <wps:wsp>
-                        <wps:cNvPr id="5" name="Graphic 5"/>
-                        <wps:cNvSpPr/>
-                        <wps:spPr>
-                          <a:xfrm>
-                            <a:off x="0" y="0"/>
-                            <a:ext cx="6572884" cy="6350"/>
-                          </a:xfrm>
-                          <a:custGeom>
-                            <a:avLst/>
-                            <a:gdLst/>
-                            <a:ahLst/>
-                            <a:cxnLst/>
-                            <a:rect l="l" t="t" r="r" b="b"/>
-                            <a:pathLst>
-                              <a:path w="6572884" h="6350">
-                                <a:moveTo>
-                                  <a:pt x="6572707" y="0"/>
-                                </a:moveTo>
-                                <a:lnTo>
-                                  <a:pt x="760425" y="0"/>
-                                </a:lnTo>
-                                <a:lnTo>
-                                  <a:pt x="754380" y="0"/>
-                                </a:lnTo>
-                                <a:lnTo>
-                                  <a:pt x="0" y="0"/>
-                                </a:lnTo>
-                                <a:lnTo>
-                                  <a:pt x="0" y="6096"/>
-                                </a:lnTo>
-                                <a:lnTo>
-                                  <a:pt x="754329" y="6096"/>
-                                </a:lnTo>
-                                <a:lnTo>
-                                  <a:pt x="760425" y="6096"/>
-                                </a:lnTo>
-                                <a:lnTo>
-                                  <a:pt x="6572707" y="6096"/>
-                                </a:lnTo>
-                                <a:lnTo>
-                                  <a:pt x="6572707" y="0"/>
-                                </a:lnTo>
-                                <a:close/>
-                              </a:path>
-                            </a:pathLst>
-                          </a:custGeom>
-                          <a:solidFill>
-                            <a:srgbClr val="000000"/>
-                          </a:solidFill>
-                        </wps:spPr>
-                        <wps:bodyPr wrap="square" lIns="0" tIns="0" rIns="0" bIns="0" rtlCol="0">
-                          <a:prstTxWarp prst="textNoShape">
-                            <a:avLst/>
-                          </a:prstTxWarp>
-                          <a:noAutofit/>
-                        </wps:bodyPr>
-                      </wps:wsp>
-                    </wpg:wgp>
-                  </a:graphicData>
-                </a:graphic>
-              </wp:inline>
-            </w:drawing>
-          </mc:Choice>
-          <mc:Fallback>
-            <w:pict>
-              <v:group w14:anchorId="2CCB4429" id="Group 4" o:spid="_x0000_s1026" style="width:517.55pt;height:.5pt;mso-position-horizontal-relative:char;mso-position-vertical-relative:line" coordsize="65728,63" o:gfxdata="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">
-                <v:shape id="Graphic 5" o:spid="_x0000_s1027" style="position:absolute;width:65728;height:63;visibility:visible;mso-wrap-style:square;v-text-anchor:top" coordsize="6572884,6350" o:gfxdata="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" path="m6572707,l760425,r-6045,l,,,6096r754329,l760425,6096r5812282,l6572707,xe" fillcolor="black" stroked="f">
-                  <v:path arrowok="t"/>
-                </v:shape>
-                <w10:anchorlock/>
-              </v:group>
-            </w:pict>
-          </mc:Fallback>
-        </mc:AlternateContent>
-      </w:r>
+          <w:sz w:val="20"/>
+        </w:rPr>
+      </w:pPr>
+    </w:p>
+    <w:p>
+      <w:pPr>
+        <w:rPr>
+          <w:rFonts w:ascii="Times New Roman"/>
+          <w:sz w:val="20"/>
+        </w:rPr>
+      </w:pPr>
+    </w:p>
+    <w:p>
+      <w:pPr>
+        <w:rPr>
+          <w:rFonts w:ascii="Times New Roman"/>
+          <w:sz w:val="20"/>
+        </w:rPr>
+      </w:pPr>
+    </w:p>
+    <w:p>
+      <w:pPr>
+        <w:rPr>
+          <w:rFonts w:ascii="Times New Roman"/>
+          <w:sz w:val="20"/>
+        </w:rPr>
+      </w:pPr>
+    </w:p>
+    <w:p>
+      <w:pPr>
+        <w:rPr>
+          <w:rFonts w:ascii="Times New Roman"/>
+          <w:sz w:val="20"/>
+        </w:rPr>
+      </w:pPr>
+    </w:p>
+    <w:p>
+      <w:pPr>
+        <w:rPr>
+          <w:rFonts w:ascii="Times New Roman"/>
+          <w:sz w:val="20"/>
+        </w:rPr>
+      </w:pPr>
+    </w:p>
+    <w:p>
+      <w:pPr>
+        <w:rPr>
+          <w:rFonts w:ascii="Times New Roman"/>
+          <w:sz w:val="20"/>
+        </w:rPr>
+      </w:pPr>
+    </w:p>
+    <w:p>
+      <w:pPr>
+        <w:rPr>
+          <w:rFonts w:ascii="Times New Roman"/>
+          <w:sz w:val="20"/>
+        </w:rPr>
+      </w:pPr>
+    </w:p>
+    <w:p>
+      <w:pPr>
+        <w:rPr>
+          <w:rFonts w:ascii="Times New Roman"/>
+          <w:sz w:val="20"/>
+        </w:rPr>
+      </w:pPr>
+    </w:p>
+    <w:p>
+      <w:pPr>
+        <w:rPr>
+          <w:rFonts w:ascii="Times New Roman"/>
+          <w:sz w:val="20"/>
+        </w:rPr>
+      </w:pPr>
+    </w:p>
+    <w:p>
+      <w:pPr>
+        <w:rPr>
+          <w:rFonts w:ascii="Times New Roman"/>
+          <w:sz w:val="20"/>
+        </w:rPr>
+      </w:pPr>
+    </w:p>
+    <w:p>
+      <w:pPr>
+        <w:rPr>
+          <w:rFonts w:ascii="Times New Roman"/>
+          <w:sz w:val="20"/>
+        </w:rPr>
+      </w:pPr>
+    </w:p>
+    <w:p>
+      <w:pPr>
+        <w:rPr>
+          <w:rFonts w:ascii="Times New Roman"/>
+          <w:sz w:val="20"/>
+        </w:rPr>
+      </w:pPr>
+    </w:p>
+    <w:p>
+      <w:pPr>
+        <w:rPr>
+          <w:rFonts w:ascii="Times New Roman"/>
+          <w:sz w:val="20"/>
+        </w:rPr>
+      </w:pPr>
+    </w:p>
+    <w:p>
+      <w:pPr>
+        <w:rPr>
+          <w:rFonts w:ascii="Times New Roman"/>
+          <w:sz w:val="20"/>
+        </w:rPr>
+      </w:pPr>
+    </w:p>
+    <w:p>
+      <w:pPr>
+        <w:rPr>
+          <w:rFonts w:ascii="Times New Roman"/>
+          <w:sz w:val="20"/>
+        </w:rPr>
+      </w:pPr>
+    </w:p>
+    <w:p>
+      <w:pPr>
+        <w:rPr>
+          <w:rFonts w:ascii="Times New Roman"/>
+          <w:sz w:val="20"/>
+        </w:rPr>
+      </w:pPr>
+    </w:p>
+    <w:p>
+      <w:pPr>
+        <w:rPr>
+          <w:rFonts w:ascii="Times New Roman"/>
+          <w:sz w:val="20"/>
+        </w:rPr>
+      </w:pPr>
+    </w:p>
+    <w:p>
+      <w:pPr>
+        <w:rPr>
+          <w:rFonts w:ascii="Times New Roman"/>
+          <w:sz w:val="20"/>
+        </w:rPr>
+      </w:pPr>
+    </w:p>
+    <w:p>
+      <w:pPr>
+        <w:rPr>
+          <w:rFonts w:ascii="Times New Roman"/>
+          <w:sz w:val="20"/>
+        </w:rPr>
+      </w:pPr>
+    </w:p>
+    <w:p>
+      <w:pPr>
+        <w:rPr>
+          <w:rFonts w:ascii="Times New Roman"/>
+          <w:sz w:val="20"/>
+        </w:rPr>
+      </w:pPr>
+    </w:p>
+    <w:p>
+      <w:pPr>
+        <w:rPr>
+          <w:rFonts w:ascii="Times New Roman"/>
+          <w:sz w:val="20"/>
+        </w:rPr>
+      </w:pPr>
+    </w:p>
+    <w:p>
+      <w:pPr>
+        <w:rPr>
+          <w:rFonts w:ascii="Times New Roman"/>
+          <w:sz w:val="20"/>
+        </w:rPr>
+      </w:pPr>
+    </w:p>
+    <w:p>
+      <w:pPr>
+        <w:rPr>
+          <w:rFonts w:ascii="Times New Roman"/>
+          <w:sz w:val="20"/>
+        </w:rPr>
+      </w:pPr>
+    </w:p>
+    <w:p>
+      <w:pPr>
+        <w:rPr>
+          <w:rFonts w:ascii="Times New Roman"/>
+          <w:sz w:val="20"/>
+        </w:rPr>
+      </w:pPr>
+    </w:p>
+    <w:p>
+      <w:pPr>
+        <w:rPr>
+          <w:rFonts w:ascii="Times New Roman"/>
+          <w:sz w:val="20"/>
+        </w:rPr>
+      </w:pPr>
+    </w:p>
+    <w:p>
+      <w:pPr>
+        <w:rPr>
+          <w:rFonts w:ascii="Times New Roman"/>
+          <w:sz w:val="20"/>
+        </w:rPr>
+      </w:pPr>
     </w:p>
     <w:p>
       <w:pPr>
@@ -1921,7 +3534,7 @@
                           <pic:cNvPicPr/>
                         </pic:nvPicPr>
                         <pic:blipFill>
-                          <a:blip r:embed="rId8" cstate="print"/>
+                          <a:blip r:embed="rId7" cstate="print"/>
                           <a:stretch>
                             <a:fillRect/>
                           </a:stretch>
@@ -2624,6 +4237,8 @@
           <w:sz w:val="24"/>
         </w:rPr>
         <w:sectPr>
+          <w:footerReference w:type="default" r:id="rId8"/>
+          <w:type w:val="continuous"/>
           <w:pgSz w:w="11910" w:h="16840"/>
           <w:pgMar w:top="1420" w:right="425" w:bottom="2514" w:left="708" w:header="0" w:footer="1000" w:gutter="0"/>
           <w:cols w:space="720"/>
@@ -5192,6 +6807,7 @@
                 <w:spacing w:val="-5"/>
                 <w:sz w:val="24"/>
               </w:rPr>
+              <w:lastRenderedPageBreak/>
               <w:t>13</w:t>
             </w:r>
           </w:p>
@@ -7358,6 +8974,22 @@
       <w:rFonts w:ascii="Times New Roman" w:eastAsia="Times New Roman" w:hAnsi="Times New Roman" w:cs="Times New Roman"/>
     </w:rPr>
   </w:style>
+  <w:style w:type="table" w:styleId="TableGrid">
+    <w:name w:val="Table Grid"/>
+    <w:basedOn w:val="TableNormal"/>
+    <w:uiPriority w:val="39"/>
+    <w:rsid w:val="00882111"/>
+    <w:tblPr>
+      <w:tblBorders>
+        <w:top w:val="single" w:sz="4" w:space="0" w:color="auto"/>
+        <w:left w:val="single" w:sz="4" w:space="0" w:color="auto"/>
+        <w:bottom w:val="single" w:sz="4" w:space="0" w:color="auto"/>
+        <w:right w:val="single" w:sz="4" w:space="0" w:color="auto"/>
+        <w:insideH w:val="single" w:sz="4" w:space="0" w:color="auto"/>
+        <w:insideV w:val="single" w:sz="4" w:space="0" w:color="auto"/>
+      </w:tblBorders>
+    </w:tblPr>
+  </w:style>
 </w:styles>
 </file>
 

</xml_diff>